<commit_message>
docs: actualizar portada del manual con logo, datos de parroquia y autor
- Logo negro de la parroquia en portada
- Datos completos: direccion, colonia, parroco, Facebook, Instagram
- Autor: L.I. Fco. Florentino Gastelum Lopez
- Copyright 2026, Hermosillo Sonora Mexico
- Instruccion para actualizar tabla de contenido en Word

Co-Authored-By: Claude Sonnet 4.6 <noreply@anthropic.com>
</commit_message>
<xml_diff>
--- a/Manual_Usuario_NSDP.docx
+++ b/Manual_Usuario_NSDP.docx
@@ -2,10 +2,120 @@
 <file path=word/document.xml><?xml version="1.0" encoding="utf-8"?>
 <w:document xmlns:wpc="http://schemas.microsoft.com/office/word/2010/wordprocessingCanvas" xmlns:mo="http://schemas.microsoft.com/office/mac/office/2008/main" xmlns:mc="http://schemas.openxmlformats.org/markup-compatibility/2006" xmlns:mv="urn:schemas-microsoft-com:mac:vml" xmlns:o="urn:schemas-microsoft-com:office:office" xmlns:r="http://schemas.openxmlformats.org/officeDocument/2006/relationships" xmlns:m="http://schemas.openxmlformats.org/officeDocument/2006/math" xmlns:v="urn:schemas-microsoft-com:vml" xmlns:wp14="http://schemas.microsoft.com/office/word/2010/wordprocessingDrawing" xmlns:wp="http://schemas.openxmlformats.org/drawingml/2006/wordprocessingDrawing" xmlns:w10="urn:schemas-microsoft-com:office:word" xmlns:w="http://schemas.openxmlformats.org/wordprocessingml/2006/main" xmlns:w14="http://schemas.microsoft.com/office/word/2010/wordml" xmlns:wpg="http://schemas.microsoft.com/office/word/2010/wordprocessingGroup" xmlns:wpi="http://schemas.microsoft.com/office/word/2010/wordprocessingInk" xmlns:wne="http://schemas.microsoft.com/office/word/2006/wordml" xmlns:wps="http://schemas.microsoft.com/office/word/2010/wordprocessingShape" mc:Ignorable="w14 wp14">
   <w:body>
-    <w:p/>
-    <w:p/>
-    <w:p/>
-    <w:p/>
+    <w:p>
+      <w:pPr>
+        <w:spacing w:before="560" w:after="160"/>
+        <w:jc w:val="center"/>
+      </w:pPr>
+      <w:r>
+        <w:drawing>
+          <wp:inline xmlns:a="http://schemas.openxmlformats.org/drawingml/2006/main" xmlns:pic="http://schemas.openxmlformats.org/drawingml/2006/picture">
+            <wp:extent cx="1645920" cy="1136244"/>
+            <wp:docPr id="1" name="Picture 1"/>
+            <wp:cNvGraphicFramePr>
+              <a:graphicFrameLocks noChangeAspect="1"/>
+            </wp:cNvGraphicFramePr>
+            <a:graphic>
+              <a:graphicData uri="http://schemas.openxmlformats.org/drawingml/2006/picture">
+                <pic:pic>
+                  <pic:nvPicPr>
+                    <pic:cNvPr id="0" name="logo_reporte.png"/>
+                    <pic:cNvPicPr/>
+                  </pic:nvPicPr>
+                  <pic:blipFill>
+                    <a:blip r:embed="rId10"/>
+                    <a:stretch>
+                      <a:fillRect/>
+                    </a:stretch>
+                  </pic:blipFill>
+                  <pic:spPr>
+                    <a:xfrm>
+                      <a:off x="0" y="0"/>
+                      <a:ext cx="1645920" cy="1136244"/>
+                    </a:xfrm>
+                    <a:prstGeom prst="rect"/>
+                  </pic:spPr>
+                </pic:pic>
+              </a:graphicData>
+            </a:graphic>
+          </wp:inline>
+        </w:drawing>
+      </w:r>
+    </w:p>
+    <w:p>
+      <w:pPr>
+        <w:jc w:val="center"/>
+      </w:pPr>
+      <w:r>
+        <w:rPr>
+          <w:rFonts w:ascii="Calibri" w:hAnsi="Calibri"/>
+          <w:b/>
+          <w:color w:val="1F3864"/>
+          <w:sz w:val="30"/>
+        </w:rPr>
+        <w:t>Parroquia Nuestra Señora de la Paz</w:t>
+      </w:r>
+    </w:p>
+    <w:p>
+      <w:pPr>
+        <w:jc w:val="center"/>
+      </w:pPr>
+      <w:r>
+        <w:rPr>
+          <w:rFonts w:ascii="Calibri" w:hAnsi="Calibri"/>
+          <w:color w:val="505050"/>
+          <w:sz w:val="20"/>
+        </w:rPr>
+        <w:t>Blvd. Quintero Arce y Blvd. Villa Bonita, Col. Villa Bonita</w:t>
+      </w:r>
+    </w:p>
+    <w:p>
+      <w:pPr>
+        <w:jc w:val="center"/>
+      </w:pPr>
+      <w:r>
+        <w:rPr>
+          <w:rFonts w:ascii="Calibri" w:hAnsi="Calibri"/>
+          <w:color w:val="505050"/>
+          <w:sz w:val="20"/>
+        </w:rPr>
+        <w:t>Hermosillo, Sonora, México</w:t>
+      </w:r>
+    </w:p>
+    <w:p>
+      <w:pPr>
+        <w:jc w:val="center"/>
+      </w:pPr>
+      <w:r>
+        <w:rPr>
+          <w:rFonts w:ascii="Calibri" w:hAnsi="Calibri"/>
+          <w:i/>
+          <w:color w:val="505050"/>
+          <w:sz w:val="20"/>
+        </w:rPr>
+        <w:t>Párroco: Gerardo Camacho Ponce</w:t>
+      </w:r>
+    </w:p>
+    <w:p>
+      <w:pPr>
+        <w:jc w:val="center"/>
+      </w:pPr>
+      <w:r>
+        <w:rPr>
+          <w:rFonts w:ascii="Calibri" w:hAnsi="Calibri"/>
+          <w:color w:val="505050"/>
+          <w:sz w:val="20"/>
+        </w:rPr>
+        <w:t>Facebook: ndsp  |  Instagram: ndsp</w:t>
+      </w:r>
+    </w:p>
+    <w:p>
+      <w:pPr>
+        <w:pBdr>
+          <w:bottom w:val="single" w:sz="6" w:space="1" w:color="1F3864"/>
+        </w:pBdr>
+      </w:pPr>
+    </w:p>
     <w:p/>
     <w:p>
       <w:pPr>
@@ -51,32 +161,6 @@
       </w:r>
     </w:p>
     <w:p/>
-    <w:p>
-      <w:pPr>
-        <w:jc w:val="center"/>
-      </w:pPr>
-      <w:r>
-        <w:rPr>
-          <w:rFonts w:ascii="Calibri" w:hAnsi="Calibri"/>
-          <w:b/>
-          <w:sz w:val="28"/>
-        </w:rPr>
-        <w:t>Parroquia Nuestra Señora de la Paz</w:t>
-      </w:r>
-    </w:p>
-    <w:p>
-      <w:pPr>
-        <w:jc w:val="center"/>
-      </w:pPr>
-      <w:r>
-        <w:rPr>
-          <w:rFonts w:ascii="Calibri" w:hAnsi="Calibri"/>
-          <w:sz w:val="26"/>
-        </w:rPr>
-        <w:t>Hermosillo, Sonora</w:t>
-      </w:r>
-    </w:p>
-    <w:p/>
     <w:p/>
     <w:p>
       <w:pPr>
@@ -89,6 +173,48 @@
           <w:sz w:val="22"/>
         </w:rPr>
         <w:t>Versión 1.0  |  Junio 2026</w:t>
+      </w:r>
+    </w:p>
+    <w:p/>
+    <w:p>
+      <w:pPr>
+        <w:jc w:val="center"/>
+      </w:pPr>
+      <w:r>
+        <w:rPr>
+          <w:rFonts w:ascii="Calibri" w:hAnsi="Calibri"/>
+          <w:b/>
+          <w:color w:val="1F3864"/>
+          <w:sz w:val="22"/>
+        </w:rPr>
+        <w:t>Autor del Sistema: L.I. Fco. Florentino Gastelum López</w:t>
+      </w:r>
+    </w:p>
+    <w:p>
+      <w:pPr>
+        <w:jc w:val="center"/>
+      </w:pPr>
+      <w:r>
+        <w:rPr>
+          <w:rFonts w:ascii="Calibri" w:hAnsi="Calibri"/>
+          <w:color w:val="505050"/>
+          <w:sz w:val="20"/>
+        </w:rPr>
+        <w:t>tinogas@gmail.com</w:t>
+      </w:r>
+    </w:p>
+    <w:p>
+      <w:pPr>
+        <w:jc w:val="center"/>
+      </w:pPr>
+      <w:r>
+        <w:rPr>
+          <w:rFonts w:ascii="Calibri" w:hAnsi="Calibri"/>
+          <w:i/>
+          <w:color w:val="707070"/>
+          <w:sz w:val="18"/>
+        </w:rPr>
+        <w:t>© Copyright 2026 — Hermosillo, Sonora, México. Todos los derechos reservados.</w:t>
       </w:r>
     </w:p>
     <w:p>
@@ -123,6 +249,20 @@
         <w:instrText xml:space="preserve">TOC \o "1-3" \h \z \u</w:instrText>
         <w:fldChar w:fldCharType="separate"/>
         <w:fldChar w:fldCharType="end"/>
+      </w:r>
+    </w:p>
+    <w:p>
+      <w:pPr>
+        <w:jc w:val="center"/>
+      </w:pPr>
+      <w:r>
+        <w:rPr>
+          <w:rFonts w:ascii="Calibri" w:hAnsi="Calibri"/>
+          <w:i/>
+          <w:color w:val="808080"/>
+          <w:sz w:val="18"/>
+        </w:rPr>
+        <w:t>(Al abrir en Word: clic derecho sobre la tabla → Actualizar campo, o presione Ctrl+A luego F9)</w:t>
       </w:r>
     </w:p>
     <w:p>

</xml_diff>